<commit_message>
Added varying input line count to Design doc
</commit_message>
<xml_diff>
--- a/hw4/Design.docx
+++ b/hw4/Design.docx
@@ -10,13 +10,23 @@
           <w:bCs/>
         </w:rPr>
       </w:pPr>
+      <w:proofErr w:type="spellStart"/>
       <w:r>
         <w:rPr>
           <w:rFonts w:asciiTheme="majorBidi" w:hAnsiTheme="majorBidi" w:cstheme="majorBidi"/>
           <w:b/>
           <w:bCs/>
         </w:rPr>
-        <w:t>Pthreads Implementation</w:t>
+        <w:t>Pthreads</w:t>
+      </w:r>
+      <w:proofErr w:type="spellEnd"/>
+      <w:r>
+        <w:rPr>
+          <w:rFonts w:asciiTheme="majorBidi" w:hAnsiTheme="majorBidi" w:cstheme="majorBidi"/>
+          <w:b/>
+          <w:bCs/>
+        </w:rPr>
+        <w:t xml:space="preserve"> Implementation</w:t>
       </w:r>
     </w:p>
     <w:p>
@@ -42,8 +52,30 @@
         <w:rPr>
           <w:rFonts w:asciiTheme="majorBidi" w:hAnsiTheme="majorBidi" w:cstheme="majorBidi"/>
         </w:rPr>
-        <w:t>The pthreads version of this application loads wiki dump and processes it in 5000 line</w:t>
-      </w:r>
+        <w:t xml:space="preserve">The </w:t>
+      </w:r>
+      <w:proofErr w:type="spellStart"/>
+      <w:r>
+        <w:rPr>
+          <w:rFonts w:asciiTheme="majorBidi" w:hAnsiTheme="majorBidi" w:cstheme="majorBidi"/>
+        </w:rPr>
+        <w:t>pthreads</w:t>
+      </w:r>
+      <w:proofErr w:type="spellEnd"/>
+      <w:r>
+        <w:rPr>
+          <w:rFonts w:asciiTheme="majorBidi" w:hAnsiTheme="majorBidi" w:cstheme="majorBidi"/>
+        </w:rPr>
+        <w:t xml:space="preserve"> version of this application loads wiki dump and processes it in 5000 </w:t>
+      </w:r>
+      <w:proofErr w:type="gramStart"/>
+      <w:r>
+        <w:rPr>
+          <w:rFonts w:asciiTheme="majorBidi" w:hAnsiTheme="majorBidi" w:cstheme="majorBidi"/>
+        </w:rPr>
+        <w:t>line</w:t>
+      </w:r>
+      <w:proofErr w:type="gramEnd"/>
     </w:p>
     <w:p>
       <w:pPr>
@@ -81,7 +113,21 @@
         <w:rPr>
           <w:rFonts w:asciiTheme="majorBidi" w:hAnsiTheme="majorBidi" w:cstheme="majorBidi"/>
         </w:rPr>
-        <w:t>thread uses pthread_join to wait for all threads to complete their chunks before printing the</w:t>
+        <w:t xml:space="preserve">thread uses </w:t>
+      </w:r>
+      <w:proofErr w:type="spellStart"/>
+      <w:r>
+        <w:rPr>
+          <w:rFonts w:asciiTheme="majorBidi" w:hAnsiTheme="majorBidi" w:cstheme="majorBidi"/>
+        </w:rPr>
+        <w:t>pthread_join</w:t>
+      </w:r>
+      <w:proofErr w:type="spellEnd"/>
+      <w:r>
+        <w:rPr>
+          <w:rFonts w:asciiTheme="majorBidi" w:hAnsiTheme="majorBidi" w:cstheme="majorBidi"/>
+        </w:rPr>
+        <w:t xml:space="preserve"> to wait for all threads to complete their chunks before printing the</w:t>
       </w:r>
     </w:p>
     <w:p>
@@ -120,7 +166,35 @@
         <w:rPr>
           <w:rFonts w:asciiTheme="majorBidi" w:hAnsiTheme="majorBidi" w:cstheme="majorBidi"/>
         </w:rPr>
-        <w:t>The initial performance analysis was gathered using the wiki_dump across 1, 2, 4, 8, and</w:t>
+        <w:t xml:space="preserve">The initial performance analysis was gathered using </w:t>
+      </w:r>
+      <w:proofErr w:type="gramStart"/>
+      <w:r>
+        <w:rPr>
+          <w:rFonts w:asciiTheme="majorBidi" w:hAnsiTheme="majorBidi" w:cstheme="majorBidi"/>
+        </w:rPr>
+        <w:t xml:space="preserve">the </w:t>
+      </w:r>
+      <w:proofErr w:type="spellStart"/>
+      <w:r>
+        <w:rPr>
+          <w:rFonts w:asciiTheme="majorBidi" w:hAnsiTheme="majorBidi" w:cstheme="majorBidi"/>
+        </w:rPr>
+        <w:t>wiki</w:t>
+      </w:r>
+      <w:proofErr w:type="gramEnd"/>
+      <w:r>
+        <w:rPr>
+          <w:rFonts w:asciiTheme="majorBidi" w:hAnsiTheme="majorBidi" w:cstheme="majorBidi"/>
+        </w:rPr>
+        <w:t>_dump</w:t>
+      </w:r>
+      <w:proofErr w:type="spellEnd"/>
+      <w:r>
+        <w:rPr>
+          <w:rFonts w:asciiTheme="majorBidi" w:hAnsiTheme="majorBidi" w:cstheme="majorBidi"/>
+        </w:rPr>
+        <w:t xml:space="preserve"> across 1, 2, 4, 8, and</w:t>
       </w:r>
     </w:p>
     <w:p>
@@ -397,17 +471,27 @@
       <w:pPr>
         <w:rPr>
           <w:rFonts w:asciiTheme="majorBidi" w:hAnsiTheme="majorBidi" w:cstheme="majorBidi"/>
-          <w:b/>
-          <w:bCs/>
         </w:rPr>
       </w:pPr>
       <w:r>
         <w:rPr>
           <w:rFonts w:asciiTheme="majorBidi" w:hAnsiTheme="majorBidi" w:cstheme="majorBidi"/>
-          <w:b/>
-          <w:bCs/>
-        </w:rPr>
-        <w:t>MPI Implementation</w:t>
+        </w:rPr>
+        <w:t xml:space="preserve">Here is more performance analysis using 100k lines and 500k lines instead of the full </w:t>
+      </w:r>
+      <w:proofErr w:type="spellStart"/>
+      <w:r>
+        <w:rPr>
+          <w:rFonts w:asciiTheme="majorBidi" w:hAnsiTheme="majorBidi" w:cstheme="majorBidi"/>
+        </w:rPr>
+        <w:t>wiki_dump</w:t>
+      </w:r>
+      <w:proofErr w:type="spellEnd"/>
+      <w:r>
+        <w:rPr>
+          <w:rFonts w:asciiTheme="majorBidi" w:hAnsiTheme="majorBidi" w:cstheme="majorBidi"/>
+        </w:rPr>
+        <w:t>.</w:t>
       </w:r>
     </w:p>
     <w:p>
@@ -416,11 +500,655 @@
           <w:rFonts w:asciiTheme="majorBidi" w:hAnsiTheme="majorBidi" w:cstheme="majorBidi"/>
         </w:rPr>
       </w:pPr>
-      <w:r>
-        <w:rPr>
-          <w:rFonts w:asciiTheme="majorBidi" w:hAnsiTheme="majorBidi" w:cstheme="majorBidi"/>
-        </w:rPr>
-        <w:t xml:space="preserve">The MPI implementation is very similar to the pthreads implementation in that it loads </w:t>
+    </w:p>
+    <w:p>
+      <w:pPr>
+        <w:rPr>
+          <w:rFonts w:asciiTheme="majorBidi" w:hAnsiTheme="majorBidi" w:cstheme="majorBidi"/>
+        </w:rPr>
+      </w:pPr>
+    </w:p>
+    <w:p>
+      <w:pPr>
+        <w:rPr>
+          <w:rFonts w:asciiTheme="majorBidi" w:hAnsiTheme="majorBidi" w:cstheme="majorBidi"/>
+        </w:rPr>
+      </w:pPr>
+      <w:r>
+        <w:rPr>
+          <w:rFonts w:asciiTheme="majorBidi" w:hAnsiTheme="majorBidi" w:cstheme="majorBidi"/>
+        </w:rPr>
+        <w:lastRenderedPageBreak/>
+        <w:t>100k</w:t>
+      </w:r>
+    </w:p>
+    <w:tbl>
+      <w:tblPr>
+        <w:tblStyle w:val="TableGrid"/>
+        <w:tblW w:w="0" w:type="auto"/>
+        <w:tblLook w:val="04A0" w:firstRow="1" w:lastRow="0" w:firstColumn="1" w:lastColumn="0" w:noHBand="0" w:noVBand="1"/>
+      </w:tblPr>
+      <w:tblGrid>
+        <w:gridCol w:w="4675"/>
+        <w:gridCol w:w="4675"/>
+      </w:tblGrid>
+      <w:tr>
+        <w:tc>
+          <w:tcPr>
+            <w:tcW w:w="4675" w:type="dxa"/>
+          </w:tcPr>
+          <w:p>
+            <w:pPr>
+              <w:rPr>
+                <w:rFonts w:asciiTheme="majorBidi" w:hAnsiTheme="majorBidi" w:cstheme="majorBidi"/>
+              </w:rPr>
+            </w:pPr>
+            <w:r>
+              <w:rPr>
+                <w:rFonts w:asciiTheme="majorBidi" w:hAnsiTheme="majorBidi" w:cstheme="majorBidi"/>
+              </w:rPr>
+              <w:t>Threads</w:t>
+            </w:r>
+          </w:p>
+        </w:tc>
+        <w:tc>
+          <w:tcPr>
+            <w:tcW w:w="4675" w:type="dxa"/>
+          </w:tcPr>
+          <w:p>
+            <w:pPr>
+              <w:rPr>
+                <w:rFonts w:asciiTheme="majorBidi" w:hAnsiTheme="majorBidi" w:cstheme="majorBidi"/>
+              </w:rPr>
+            </w:pPr>
+            <w:r>
+              <w:rPr>
+                <w:rFonts w:asciiTheme="majorBidi" w:hAnsiTheme="majorBidi" w:cstheme="majorBidi"/>
+              </w:rPr>
+              <w:t>Execution Time</w:t>
+            </w:r>
+          </w:p>
+        </w:tc>
+      </w:tr>
+      <w:tr>
+        <w:tc>
+          <w:tcPr>
+            <w:tcW w:w="4675" w:type="dxa"/>
+            <w:vAlign w:val="bottom"/>
+          </w:tcPr>
+          <w:p>
+            <w:pPr>
+              <w:rPr>
+                <w:rFonts w:asciiTheme="majorBidi" w:hAnsiTheme="majorBidi" w:cstheme="majorBidi"/>
+              </w:rPr>
+            </w:pPr>
+            <w:r>
+              <w:rPr>
+                <w:rFonts w:ascii="Aptos Narrow" w:hAnsi="Aptos Narrow"/>
+                <w:color w:val="000000"/>
+                <w:sz w:val="22"/>
+                <w:szCs w:val="22"/>
+              </w:rPr>
+              <w:t>1</w:t>
+            </w:r>
+          </w:p>
+        </w:tc>
+        <w:tc>
+          <w:tcPr>
+            <w:tcW w:w="4675" w:type="dxa"/>
+            <w:vAlign w:val="bottom"/>
+          </w:tcPr>
+          <w:p>
+            <w:pPr>
+              <w:rPr>
+                <w:rFonts w:asciiTheme="majorBidi" w:hAnsiTheme="majorBidi" w:cstheme="majorBidi"/>
+              </w:rPr>
+            </w:pPr>
+            <w:r>
+              <w:rPr>
+                <w:rFonts w:ascii="Aptos Narrow" w:hAnsi="Aptos Narrow"/>
+                <w:color w:val="000000"/>
+                <w:sz w:val="22"/>
+                <w:szCs w:val="22"/>
+              </w:rPr>
+              <w:t>0.42</w:t>
+            </w:r>
+          </w:p>
+        </w:tc>
+      </w:tr>
+      <w:tr>
+        <w:tc>
+          <w:tcPr>
+            <w:tcW w:w="4675" w:type="dxa"/>
+            <w:vAlign w:val="bottom"/>
+          </w:tcPr>
+          <w:p>
+            <w:pPr>
+              <w:rPr>
+                <w:rFonts w:asciiTheme="majorBidi" w:hAnsiTheme="majorBidi" w:cstheme="majorBidi"/>
+              </w:rPr>
+            </w:pPr>
+            <w:r>
+              <w:rPr>
+                <w:rFonts w:ascii="Aptos Narrow" w:hAnsi="Aptos Narrow"/>
+                <w:color w:val="000000"/>
+                <w:sz w:val="22"/>
+                <w:szCs w:val="22"/>
+              </w:rPr>
+              <w:t>2</w:t>
+            </w:r>
+          </w:p>
+        </w:tc>
+        <w:tc>
+          <w:tcPr>
+            <w:tcW w:w="4675" w:type="dxa"/>
+            <w:vAlign w:val="bottom"/>
+          </w:tcPr>
+          <w:p>
+            <w:pPr>
+              <w:rPr>
+                <w:rFonts w:asciiTheme="majorBidi" w:hAnsiTheme="majorBidi" w:cstheme="majorBidi"/>
+              </w:rPr>
+            </w:pPr>
+            <w:r>
+              <w:rPr>
+                <w:rFonts w:ascii="Aptos Narrow" w:hAnsi="Aptos Narrow"/>
+                <w:color w:val="000000"/>
+                <w:sz w:val="22"/>
+                <w:szCs w:val="22"/>
+              </w:rPr>
+              <w:t>0.15</w:t>
+            </w:r>
+          </w:p>
+        </w:tc>
+      </w:tr>
+      <w:tr>
+        <w:tc>
+          <w:tcPr>
+            <w:tcW w:w="4675" w:type="dxa"/>
+            <w:vAlign w:val="bottom"/>
+          </w:tcPr>
+          <w:p>
+            <w:pPr>
+              <w:rPr>
+                <w:rFonts w:asciiTheme="majorBidi" w:hAnsiTheme="majorBidi" w:cstheme="majorBidi"/>
+              </w:rPr>
+            </w:pPr>
+            <w:r>
+              <w:rPr>
+                <w:rFonts w:ascii="Aptos Narrow" w:hAnsi="Aptos Narrow"/>
+                <w:color w:val="000000"/>
+                <w:sz w:val="22"/>
+                <w:szCs w:val="22"/>
+              </w:rPr>
+              <w:t>4</w:t>
+            </w:r>
+          </w:p>
+        </w:tc>
+        <w:tc>
+          <w:tcPr>
+            <w:tcW w:w="4675" w:type="dxa"/>
+            <w:vAlign w:val="bottom"/>
+          </w:tcPr>
+          <w:p>
+            <w:pPr>
+              <w:rPr>
+                <w:rFonts w:asciiTheme="majorBidi" w:hAnsiTheme="majorBidi" w:cstheme="majorBidi"/>
+              </w:rPr>
+            </w:pPr>
+            <w:r>
+              <w:rPr>
+                <w:rFonts w:ascii="Aptos Narrow" w:hAnsi="Aptos Narrow"/>
+                <w:color w:val="000000"/>
+                <w:sz w:val="22"/>
+                <w:szCs w:val="22"/>
+              </w:rPr>
+              <w:t>0.12</w:t>
+            </w:r>
+          </w:p>
+        </w:tc>
+      </w:tr>
+      <w:tr>
+        <w:tc>
+          <w:tcPr>
+            <w:tcW w:w="4675" w:type="dxa"/>
+            <w:vAlign w:val="bottom"/>
+          </w:tcPr>
+          <w:p>
+            <w:pPr>
+              <w:rPr>
+                <w:rFonts w:asciiTheme="majorBidi" w:hAnsiTheme="majorBidi" w:cstheme="majorBidi"/>
+              </w:rPr>
+            </w:pPr>
+            <w:r>
+              <w:rPr>
+                <w:rFonts w:ascii="Aptos Narrow" w:hAnsi="Aptos Narrow"/>
+                <w:color w:val="000000"/>
+                <w:sz w:val="22"/>
+                <w:szCs w:val="22"/>
+              </w:rPr>
+              <w:t>8</w:t>
+            </w:r>
+          </w:p>
+        </w:tc>
+        <w:tc>
+          <w:tcPr>
+            <w:tcW w:w="4675" w:type="dxa"/>
+            <w:vAlign w:val="bottom"/>
+          </w:tcPr>
+          <w:p>
+            <w:pPr>
+              <w:rPr>
+                <w:rFonts w:asciiTheme="majorBidi" w:hAnsiTheme="majorBidi" w:cstheme="majorBidi"/>
+              </w:rPr>
+            </w:pPr>
+            <w:r>
+              <w:rPr>
+                <w:rFonts w:ascii="Aptos Narrow" w:hAnsi="Aptos Narrow"/>
+                <w:color w:val="000000"/>
+                <w:sz w:val="22"/>
+                <w:szCs w:val="22"/>
+              </w:rPr>
+              <w:t>0.11</w:t>
+            </w:r>
+          </w:p>
+        </w:tc>
+      </w:tr>
+      <w:tr>
+        <w:tc>
+          <w:tcPr>
+            <w:tcW w:w="4675" w:type="dxa"/>
+            <w:vAlign w:val="bottom"/>
+          </w:tcPr>
+          <w:p>
+            <w:pPr>
+              <w:rPr>
+                <w:rFonts w:asciiTheme="majorBidi" w:hAnsiTheme="majorBidi" w:cstheme="majorBidi"/>
+              </w:rPr>
+            </w:pPr>
+            <w:r>
+              <w:rPr>
+                <w:rFonts w:ascii="Aptos Narrow" w:hAnsi="Aptos Narrow"/>
+                <w:color w:val="000000"/>
+                <w:sz w:val="22"/>
+                <w:szCs w:val="22"/>
+              </w:rPr>
+              <w:t>16</w:t>
+            </w:r>
+          </w:p>
+        </w:tc>
+        <w:tc>
+          <w:tcPr>
+            <w:tcW w:w="4675" w:type="dxa"/>
+            <w:vAlign w:val="bottom"/>
+          </w:tcPr>
+          <w:p>
+            <w:pPr>
+              <w:rPr>
+                <w:rFonts w:asciiTheme="majorBidi" w:hAnsiTheme="majorBidi" w:cstheme="majorBidi"/>
+              </w:rPr>
+            </w:pPr>
+            <w:r>
+              <w:rPr>
+                <w:rFonts w:ascii="Aptos Narrow" w:hAnsi="Aptos Narrow"/>
+                <w:color w:val="000000"/>
+                <w:sz w:val="22"/>
+                <w:szCs w:val="22"/>
+              </w:rPr>
+              <w:t>0.11</w:t>
+            </w:r>
+          </w:p>
+        </w:tc>
+      </w:tr>
+    </w:tbl>
+    <w:p>
+      <w:pPr>
+        <w:rPr>
+          <w:rFonts w:asciiTheme="majorBidi" w:hAnsiTheme="majorBidi" w:cstheme="majorBidi"/>
+        </w:rPr>
+      </w:pPr>
+    </w:p>
+    <w:p>
+      <w:pPr>
+        <w:rPr>
+          <w:rFonts w:asciiTheme="majorBidi" w:hAnsiTheme="majorBidi" w:cstheme="majorBidi"/>
+        </w:rPr>
+      </w:pPr>
+      <w:r>
+        <w:rPr>
+          <w:rFonts w:asciiTheme="majorBidi" w:hAnsiTheme="majorBidi" w:cstheme="majorBidi"/>
+        </w:rPr>
+        <w:t>500k</w:t>
+      </w:r>
+    </w:p>
+    <w:tbl>
+      <w:tblPr>
+        <w:tblStyle w:val="TableGrid"/>
+        <w:tblW w:w="0" w:type="auto"/>
+        <w:tblLook w:val="04A0" w:firstRow="1" w:lastRow="0" w:firstColumn="1" w:lastColumn="0" w:noHBand="0" w:noVBand="1"/>
+      </w:tblPr>
+      <w:tblGrid>
+        <w:gridCol w:w="4675"/>
+        <w:gridCol w:w="4675"/>
+      </w:tblGrid>
+      <w:tr>
+        <w:tc>
+          <w:tcPr>
+            <w:tcW w:w="4675" w:type="dxa"/>
+          </w:tcPr>
+          <w:p>
+            <w:pPr>
+              <w:rPr>
+                <w:rFonts w:asciiTheme="majorBidi" w:hAnsiTheme="majorBidi" w:cstheme="majorBidi"/>
+              </w:rPr>
+            </w:pPr>
+            <w:r>
+              <w:rPr>
+                <w:rFonts w:asciiTheme="majorBidi" w:hAnsiTheme="majorBidi" w:cstheme="majorBidi"/>
+              </w:rPr>
+              <w:t>Threads</w:t>
+            </w:r>
+          </w:p>
+        </w:tc>
+        <w:tc>
+          <w:tcPr>
+            <w:tcW w:w="4675" w:type="dxa"/>
+          </w:tcPr>
+          <w:p>
+            <w:pPr>
+              <w:rPr>
+                <w:rFonts w:asciiTheme="majorBidi" w:hAnsiTheme="majorBidi" w:cstheme="majorBidi"/>
+              </w:rPr>
+            </w:pPr>
+            <w:r>
+              <w:rPr>
+                <w:rFonts w:asciiTheme="majorBidi" w:hAnsiTheme="majorBidi" w:cstheme="majorBidi"/>
+              </w:rPr>
+              <w:t>Execution Time</w:t>
+            </w:r>
+          </w:p>
+        </w:tc>
+      </w:tr>
+      <w:tr>
+        <w:tc>
+          <w:tcPr>
+            <w:tcW w:w="4675" w:type="dxa"/>
+            <w:vAlign w:val="bottom"/>
+          </w:tcPr>
+          <w:p>
+            <w:pPr>
+              <w:rPr>
+                <w:rFonts w:asciiTheme="majorBidi" w:hAnsiTheme="majorBidi" w:cstheme="majorBidi"/>
+              </w:rPr>
+            </w:pPr>
+            <w:r>
+              <w:rPr>
+                <w:rFonts w:ascii="Aptos Narrow" w:hAnsi="Aptos Narrow"/>
+                <w:color w:val="000000"/>
+                <w:sz w:val="22"/>
+                <w:szCs w:val="22"/>
+              </w:rPr>
+              <w:t>1</w:t>
+            </w:r>
+          </w:p>
+        </w:tc>
+        <w:tc>
+          <w:tcPr>
+            <w:tcW w:w="4675" w:type="dxa"/>
+            <w:vAlign w:val="bottom"/>
+          </w:tcPr>
+          <w:p>
+            <w:pPr>
+              <w:rPr>
+                <w:rFonts w:asciiTheme="majorBidi" w:hAnsiTheme="majorBidi" w:cstheme="majorBidi"/>
+              </w:rPr>
+            </w:pPr>
+            <w:r>
+              <w:rPr>
+                <w:rFonts w:ascii="Aptos Narrow" w:hAnsi="Aptos Narrow"/>
+                <w:color w:val="000000"/>
+                <w:sz w:val="22"/>
+                <w:szCs w:val="22"/>
+              </w:rPr>
+              <w:t>0.99</w:t>
+            </w:r>
+          </w:p>
+        </w:tc>
+      </w:tr>
+      <w:tr>
+        <w:tc>
+          <w:tcPr>
+            <w:tcW w:w="4675" w:type="dxa"/>
+            <w:vAlign w:val="bottom"/>
+          </w:tcPr>
+          <w:p>
+            <w:pPr>
+              <w:rPr>
+                <w:rFonts w:asciiTheme="majorBidi" w:hAnsiTheme="majorBidi" w:cstheme="majorBidi"/>
+              </w:rPr>
+            </w:pPr>
+            <w:r>
+              <w:rPr>
+                <w:rFonts w:ascii="Aptos Narrow" w:hAnsi="Aptos Narrow"/>
+                <w:color w:val="000000"/>
+                <w:sz w:val="22"/>
+                <w:szCs w:val="22"/>
+              </w:rPr>
+              <w:t>2</w:t>
+            </w:r>
+          </w:p>
+        </w:tc>
+        <w:tc>
+          <w:tcPr>
+            <w:tcW w:w="4675" w:type="dxa"/>
+            <w:vAlign w:val="bottom"/>
+          </w:tcPr>
+          <w:p>
+            <w:pPr>
+              <w:rPr>
+                <w:rFonts w:asciiTheme="majorBidi" w:hAnsiTheme="majorBidi" w:cstheme="majorBidi"/>
+              </w:rPr>
+            </w:pPr>
+            <w:r>
+              <w:rPr>
+                <w:rFonts w:ascii="Aptos Narrow" w:hAnsi="Aptos Narrow"/>
+                <w:color w:val="000000"/>
+                <w:sz w:val="22"/>
+                <w:szCs w:val="22"/>
+              </w:rPr>
+              <w:t>0.7</w:t>
+            </w:r>
+          </w:p>
+        </w:tc>
+      </w:tr>
+      <w:tr>
+        <w:tc>
+          <w:tcPr>
+            <w:tcW w:w="4675" w:type="dxa"/>
+            <w:vAlign w:val="bottom"/>
+          </w:tcPr>
+          <w:p>
+            <w:pPr>
+              <w:rPr>
+                <w:rFonts w:asciiTheme="majorBidi" w:hAnsiTheme="majorBidi" w:cstheme="majorBidi"/>
+              </w:rPr>
+            </w:pPr>
+            <w:r>
+              <w:rPr>
+                <w:rFonts w:ascii="Aptos Narrow" w:hAnsi="Aptos Narrow"/>
+                <w:color w:val="000000"/>
+                <w:sz w:val="22"/>
+                <w:szCs w:val="22"/>
+              </w:rPr>
+              <w:t>4</w:t>
+            </w:r>
+          </w:p>
+        </w:tc>
+        <w:tc>
+          <w:tcPr>
+            <w:tcW w:w="4675" w:type="dxa"/>
+            <w:vAlign w:val="bottom"/>
+          </w:tcPr>
+          <w:p>
+            <w:pPr>
+              <w:rPr>
+                <w:rFonts w:asciiTheme="majorBidi" w:hAnsiTheme="majorBidi" w:cstheme="majorBidi"/>
+              </w:rPr>
+            </w:pPr>
+            <w:r>
+              <w:rPr>
+                <w:rFonts w:ascii="Aptos Narrow" w:hAnsi="Aptos Narrow"/>
+                <w:color w:val="000000"/>
+                <w:sz w:val="22"/>
+                <w:szCs w:val="22"/>
+              </w:rPr>
+              <w:t>0.58</w:t>
+            </w:r>
+          </w:p>
+        </w:tc>
+      </w:tr>
+      <w:tr>
+        <w:tc>
+          <w:tcPr>
+            <w:tcW w:w="4675" w:type="dxa"/>
+            <w:vAlign w:val="bottom"/>
+          </w:tcPr>
+          <w:p>
+            <w:pPr>
+              <w:rPr>
+                <w:rFonts w:asciiTheme="majorBidi" w:hAnsiTheme="majorBidi" w:cstheme="majorBidi"/>
+              </w:rPr>
+            </w:pPr>
+            <w:r>
+              <w:rPr>
+                <w:rFonts w:ascii="Aptos Narrow" w:hAnsi="Aptos Narrow"/>
+                <w:color w:val="000000"/>
+                <w:sz w:val="22"/>
+                <w:szCs w:val="22"/>
+              </w:rPr>
+              <w:t>8</w:t>
+            </w:r>
+          </w:p>
+        </w:tc>
+        <w:tc>
+          <w:tcPr>
+            <w:tcW w:w="4675" w:type="dxa"/>
+            <w:vAlign w:val="bottom"/>
+          </w:tcPr>
+          <w:p>
+            <w:pPr>
+              <w:rPr>
+                <w:rFonts w:asciiTheme="majorBidi" w:hAnsiTheme="majorBidi" w:cstheme="majorBidi"/>
+              </w:rPr>
+            </w:pPr>
+            <w:r>
+              <w:rPr>
+                <w:rFonts w:ascii="Aptos Narrow" w:hAnsi="Aptos Narrow"/>
+                <w:color w:val="000000"/>
+                <w:sz w:val="22"/>
+                <w:szCs w:val="22"/>
+              </w:rPr>
+              <w:t>0.53</w:t>
+            </w:r>
+          </w:p>
+        </w:tc>
+      </w:tr>
+      <w:tr>
+        <w:tc>
+          <w:tcPr>
+            <w:tcW w:w="4675" w:type="dxa"/>
+            <w:vAlign w:val="bottom"/>
+          </w:tcPr>
+          <w:p>
+            <w:pPr>
+              <w:rPr>
+                <w:rFonts w:asciiTheme="majorBidi" w:hAnsiTheme="majorBidi" w:cstheme="majorBidi"/>
+              </w:rPr>
+            </w:pPr>
+            <w:r>
+              <w:rPr>
+                <w:rFonts w:ascii="Aptos Narrow" w:hAnsi="Aptos Narrow"/>
+                <w:color w:val="000000"/>
+                <w:sz w:val="22"/>
+                <w:szCs w:val="22"/>
+              </w:rPr>
+              <w:t>16</w:t>
+            </w:r>
+          </w:p>
+        </w:tc>
+        <w:tc>
+          <w:tcPr>
+            <w:tcW w:w="4675" w:type="dxa"/>
+            <w:vAlign w:val="bottom"/>
+          </w:tcPr>
+          <w:p>
+            <w:pPr>
+              <w:rPr>
+                <w:rFonts w:asciiTheme="majorBidi" w:hAnsiTheme="majorBidi" w:cstheme="majorBidi"/>
+              </w:rPr>
+            </w:pPr>
+            <w:r>
+              <w:rPr>
+                <w:rFonts w:ascii="Aptos Narrow" w:hAnsi="Aptos Narrow"/>
+                <w:color w:val="000000"/>
+                <w:sz w:val="22"/>
+                <w:szCs w:val="22"/>
+              </w:rPr>
+              <w:t>0.59</w:t>
+            </w:r>
+          </w:p>
+        </w:tc>
+      </w:tr>
+    </w:tbl>
+    <w:p>
+      <w:pPr>
+        <w:rPr>
+          <w:rFonts w:asciiTheme="majorBidi" w:hAnsiTheme="majorBidi" w:cstheme="majorBidi"/>
+        </w:rPr>
+      </w:pPr>
+    </w:p>
+    <w:p>
+      <w:pPr>
+        <w:rPr>
+          <w:rFonts w:asciiTheme="majorBidi" w:hAnsiTheme="majorBidi" w:cstheme="majorBidi"/>
+          <w:b/>
+          <w:bCs/>
+        </w:rPr>
+      </w:pPr>
+      <w:r>
+        <w:rPr>
+          <w:rFonts w:asciiTheme="majorBidi" w:hAnsiTheme="majorBidi" w:cstheme="majorBidi"/>
+          <w:b/>
+          <w:bCs/>
+        </w:rPr>
+        <w:t>MPI Implementation</w:t>
+      </w:r>
+    </w:p>
+    <w:p>
+      <w:pPr>
+        <w:rPr>
+          <w:rFonts w:asciiTheme="majorBidi" w:hAnsiTheme="majorBidi" w:cstheme="majorBidi"/>
+        </w:rPr>
+      </w:pPr>
+      <w:r>
+        <w:rPr>
+          <w:rFonts w:asciiTheme="majorBidi" w:hAnsiTheme="majorBidi" w:cstheme="majorBidi"/>
+        </w:rPr>
+        <w:t xml:space="preserve">The MPI implementation is very similar to the </w:t>
+      </w:r>
+      <w:proofErr w:type="spellStart"/>
+      <w:r>
+        <w:rPr>
+          <w:rFonts w:asciiTheme="majorBidi" w:hAnsiTheme="majorBidi" w:cstheme="majorBidi"/>
+        </w:rPr>
+        <w:t>pthreads</w:t>
+      </w:r>
+      <w:proofErr w:type="spellEnd"/>
+      <w:r>
+        <w:rPr>
+          <w:rFonts w:asciiTheme="majorBidi" w:hAnsiTheme="majorBidi" w:cstheme="majorBidi"/>
+        </w:rPr>
+        <w:t xml:space="preserve"> implementation in that it loads </w:t>
       </w:r>
       <w:r>
         <w:rPr>
@@ -432,7 +1160,21 @@
         <w:rPr>
           <w:rFonts w:asciiTheme="majorBidi" w:hAnsiTheme="majorBidi" w:cstheme="majorBidi"/>
         </w:rPr>
-        <w:t xml:space="preserve"> and send it off to worker processes. However, instead of loading it into different threads, the program does it via processes. The processes then send data back to the master process which then </w:t>
+        <w:t xml:space="preserve"> and </w:t>
+      </w:r>
+      <w:proofErr w:type="gramStart"/>
+      <w:r>
+        <w:rPr>
+          <w:rFonts w:asciiTheme="majorBidi" w:hAnsiTheme="majorBidi" w:cstheme="majorBidi"/>
+        </w:rPr>
+        <w:t>send</w:t>
+      </w:r>
+      <w:proofErr w:type="gramEnd"/>
+      <w:r>
+        <w:rPr>
+          <w:rFonts w:asciiTheme="majorBidi" w:hAnsiTheme="majorBidi" w:cstheme="majorBidi"/>
+        </w:rPr>
+        <w:t xml:space="preserve"> it off to worker processes. However, instead of loading it into different threads, the program does it via processes. The processes then send data back to the master process which then </w:t>
       </w:r>
       <w:r>
         <w:rPr>
@@ -444,20 +1186,27 @@
         <w:rPr>
           <w:rFonts w:asciiTheme="majorBidi" w:hAnsiTheme="majorBidi" w:cstheme="majorBidi"/>
         </w:rPr>
-        <w:t xml:space="preserve"> data nicely. The pthreads </w:t>
-      </w:r>
-      <w:r>
-        <w:rPr>
-          <w:rFonts w:asciiTheme="majorBidi" w:hAnsiTheme="majorBidi" w:cstheme="majorBidi"/>
-        </w:rPr>
-        <w:t xml:space="preserve">utilizes global variables, while the MPI implementation </w:t>
-      </w:r>
-      <w:r>
-        <w:rPr>
-          <w:rFonts w:asciiTheme="majorBidi" w:hAnsiTheme="majorBidi" w:cstheme="majorBidi"/>
-        </w:rPr>
-        <w:lastRenderedPageBreak/>
-        <w:t>uses local variables and sends and receives them between each other to corresponding local variables of the same type.</w:t>
+        <w:t xml:space="preserve"> data nicely. The </w:t>
+      </w:r>
+      <w:proofErr w:type="spellStart"/>
+      <w:r>
+        <w:rPr>
+          <w:rFonts w:asciiTheme="majorBidi" w:hAnsiTheme="majorBidi" w:cstheme="majorBidi"/>
+        </w:rPr>
+        <w:t>pthreads</w:t>
+      </w:r>
+      <w:proofErr w:type="spellEnd"/>
+      <w:r>
+        <w:rPr>
+          <w:rFonts w:asciiTheme="majorBidi" w:hAnsiTheme="majorBidi" w:cstheme="majorBidi"/>
+        </w:rPr>
+        <w:t xml:space="preserve"> </w:t>
+      </w:r>
+      <w:r>
+        <w:rPr>
+          <w:rFonts w:asciiTheme="majorBidi" w:hAnsiTheme="majorBidi" w:cstheme="majorBidi"/>
+        </w:rPr>
+        <w:t>utilizes global variables, while the MPI implementation uses local variables and sends and receives them between each other to corresponding local variables of the same type.</w:t>
       </w:r>
     </w:p>
     <w:p>
@@ -586,7 +1335,21 @@
         <w:rPr>
           <w:rFonts w:asciiTheme="majorBidi" w:hAnsiTheme="majorBidi" w:cstheme="majorBidi"/>
         </w:rPr>
-        <w:t>The initial performance analysis was gathered using the wiki_dump across 1, 2, 4, 8, and 16 threads.</w:t>
+        <w:t xml:space="preserve">The initial performance analysis was gathered using the </w:t>
+      </w:r>
+      <w:proofErr w:type="spellStart"/>
+      <w:r>
+        <w:rPr>
+          <w:rFonts w:asciiTheme="majorBidi" w:hAnsiTheme="majorBidi" w:cstheme="majorBidi"/>
+        </w:rPr>
+        <w:t>wiki_dump</w:t>
+      </w:r>
+      <w:proofErr w:type="spellEnd"/>
+      <w:r>
+        <w:rPr>
+          <w:rFonts w:asciiTheme="majorBidi" w:hAnsiTheme="majorBidi" w:cstheme="majorBidi"/>
+        </w:rPr>
+        <w:t xml:space="preserve"> across 1, 2, 4, 8, and 16 threads.</w:t>
       </w:r>
     </w:p>
     <w:tbl>
@@ -851,7 +1614,6 @@
         <w:rPr>
           <w:noProof/>
         </w:rPr>
-        <w:lastRenderedPageBreak/>
         <w:drawing>
           <wp:inline distT="0" distB="0" distL="0" distR="0" wp14:anchorId="6BE5588D" wp14:editId="588308B7">
             <wp:extent cx="4572000" cy="2743200"/>
@@ -892,6 +1654,7 @@
         <w:rPr>
           <w:rFonts w:asciiTheme="majorBidi" w:hAnsiTheme="majorBidi" w:cstheme="majorBidi"/>
         </w:rPr>
+        <w:lastRenderedPageBreak/>
         <w:t xml:space="preserve">These results show improvements when increasing thread count until after 8 threads, when gains diminished. OpenMP does not scale across multiple nodes. </w:t>
       </w:r>
     </w:p>

</xml_diff>